<commit_message>
update on 2025-11-10 10:28:32.783205
</commit_message>
<xml_diff>
--- a/py 文件IO.docx
+++ b/py 文件IO.docx
@@ -480,8 +480,8 @@
           </w14:textFill>
         </w:rPr>
       </w:pPr>
-      <w:bookmarkStart w:id="3" w:name="_Toc10290"/>
-      <w:bookmarkStart w:id="4" w:name="_Toc30074"/>
+      <w:bookmarkStart w:id="3" w:name="_Toc30074"/>
+      <w:bookmarkStart w:id="4" w:name="_Toc10290"/>
       <w:r>
         <w:rPr>
           <w:rFonts w:hint="eastAsia" w:ascii="华文中宋" w:hAnsi="华文中宋" w:eastAsia="华文中宋" w:cs="华文中宋"/>
@@ -1117,7 +1117,7 @@
                 <w:vertAlign w:val="baseline"/>
                 <w:lang w:val="en-US" w:eastAsia="zh-CN"/>
               </w:rPr>
-              <w:t>drive</w:t>
+              <w:t>drive / parts</w:t>
             </w:r>
           </w:p>
         </w:tc>
@@ -1156,8 +1156,10 @@
                 <w:szCs w:val="21"/>
                 <w:lang w:val="en-US" w:eastAsia="zh-CN"/>
               </w:rPr>
-              <w:t>盘符</w:t>
-            </w:r>
+              <w:t>盘符/成分</w:t>
+            </w:r>
+            <w:bookmarkStart w:id="23" w:name="_GoBack"/>
+            <w:bookmarkEnd w:id="23"/>
           </w:p>
         </w:tc>
       </w:tr>
@@ -1251,7 +1253,7 @@
                 <w:vertAlign w:val="baseline"/>
                 <w:lang w:val="en-US" w:eastAsia="zh-CN"/>
               </w:rPr>
-              <w:t>parent</w:t>
+              <w:t>parent / parents</w:t>
             </w:r>
           </w:p>
         </w:tc>
@@ -1298,27 +1300,6 @@
                 <w:lang w:val="en-US" w:eastAsia="zh-CN"/>
               </w:rPr>
               <w:t>前级</w:t>
-            </w:r>
-            <w:r>
-              <w:rPr>
-                <w:rFonts w:hint="eastAsia" w:cs="华文中宋"/>
-                <w:b/>
-                <w:bCs/>
-                <w:i w:val="0"/>
-                <w:caps w:val="0"/>
-                <w:color w:val="ED7D31" w:themeColor="accent2"/>
-                <w:spacing w:val="7"/>
-                <w:sz w:val="21"/>
-                <w:szCs w:val="21"/>
-                <w:vertAlign w:val="baseline"/>
-                <w:lang w:val="en-US" w:eastAsia="zh-CN"/>
-                <w14:textFill>
-                  <w14:solidFill>
-                    <w14:schemeClr w14:val="accent2"/>
-                  </w14:solidFill>
-                </w14:textFill>
-              </w:rPr>
-              <w:t>路径</w:t>
             </w:r>
           </w:p>
         </w:tc>
@@ -1340,9 +1321,6 @@
             <w:right w:w="108" w:type="dxa"/>
           </w:tblCellMar>
         </w:tblPrEx>
-        <w:trPr>
-          <w:trHeight w:val="90" w:hRule="atLeast"/>
-        </w:trPr>
         <w:tc>
           <w:tcPr>
             <w:tcW w:w="0" w:type="auto"/>
@@ -1412,7 +1390,7 @@
                 <w:vertAlign w:val="baseline"/>
                 <w:lang w:val="en-US" w:eastAsia="zh-CN"/>
               </w:rPr>
-              <w:t>name</w:t>
+              <w:t>name / stem / suffix</w:t>
             </w:r>
           </w:p>
         </w:tc>
@@ -1433,32 +1411,12 @@
                 <w:caps w:val="0"/>
                 <w:color w:val="EA82F1"/>
                 <w:spacing w:val="7"/>
-                <w:sz w:val="21"/>
-                <w:szCs w:val="21"/>
-                <w:lang w:val="en-US" w:eastAsia="zh-CN"/>
-              </w:rPr>
-            </w:pPr>
-            <w:r>
-              <w:rPr>
-                <w:rFonts w:hint="eastAsia" w:cs="华文中宋"/>
-                <w:b/>
-                <w:bCs/>
-                <w:i w:val="0"/>
-                <w:caps w:val="0"/>
-                <w:color w:val="ED7D31" w:themeColor="accent2"/>
-                <w:spacing w:val="7"/>
-                <w:sz w:val="21"/>
-                <w:szCs w:val="21"/>
-                <w:vertAlign w:val="baseline"/>
-                <w:lang w:val="en-US" w:eastAsia="zh-CN"/>
-                <w14:textFill>
-                  <w14:solidFill>
-                    <w14:schemeClr w14:val="accent2"/>
-                  </w14:solidFill>
-                </w14:textFill>
-              </w:rPr>
-              <w:t>有后缀</w:t>
-            </w:r>
+                <w:kern w:val="2"/>
+                <w:sz w:val="21"/>
+                <w:szCs w:val="21"/>
+                <w:lang w:val="en-US" w:eastAsia="zh-CN" w:bidi="ar-SA"/>
+              </w:rPr>
+            </w:pPr>
             <w:r>
               <w:rPr>
                 <w:rFonts w:hint="eastAsia" w:cs="华文中宋"/>
@@ -1472,317 +1430,7 @@
                 <w:szCs w:val="21"/>
                 <w:lang w:val="en-US" w:eastAsia="zh-CN"/>
               </w:rPr>
-              <w:t>文件名</w:t>
-            </w:r>
-          </w:p>
-        </w:tc>
-      </w:tr>
-      <w:tr>
-        <w:tblPrEx>
-          <w:tblBorders>
-            <w:top w:val="single" w:color="auto" w:sz="4" w:space="0"/>
-            <w:left w:val="single" w:color="auto" w:sz="4" w:space="0"/>
-            <w:bottom w:val="single" w:color="auto" w:sz="4" w:space="0"/>
-            <w:right w:val="single" w:color="auto" w:sz="4" w:space="0"/>
-            <w:insideH w:val="single" w:color="auto" w:sz="4" w:space="0"/>
-            <w:insideV w:val="single" w:color="auto" w:sz="4" w:space="0"/>
-          </w:tblBorders>
-          <w:tblCellMar>
-            <w:top w:w="0" w:type="dxa"/>
-            <w:left w:w="108" w:type="dxa"/>
-            <w:bottom w:w="0" w:type="dxa"/>
-            <w:right w:w="108" w:type="dxa"/>
-          </w:tblCellMar>
-        </w:tblPrEx>
-        <w:tc>
-          <w:tcPr>
-            <w:tcW w:w="0" w:type="auto"/>
-            <w:vMerge w:val="continue"/>
-            <w:vAlign w:val="center"/>
-          </w:tcPr>
-          <w:p>
-            <w:pPr>
-              <w:outlineLvl w:val="9"/>
-              <w:rPr>
-                <w:rFonts w:hint="eastAsia" w:ascii="华文中宋" w:hAnsi="华文中宋" w:eastAsia="华文中宋" w:cs="华文中宋"/>
-                <w:b/>
-                <w:bCs/>
-                <w:i w:val="0"/>
-                <w:caps w:val="0"/>
-                <w:color w:val="ED7D31" w:themeColor="accent2"/>
-                <w:spacing w:val="7"/>
-                <w:sz w:val="21"/>
-                <w:szCs w:val="21"/>
-                <w:vertAlign w:val="baseline"/>
-                <w:lang w:val="en-US" w:eastAsia="zh-CN"/>
-                <w14:textFill>
-                  <w14:solidFill>
-                    <w14:schemeClr w14:val="accent2"/>
-                  </w14:solidFill>
-                </w14:textFill>
-              </w:rPr>
-            </w:pPr>
-          </w:p>
-        </w:tc>
-        <w:tc>
-          <w:tcPr>
-            <w:tcW w:w="0" w:type="auto"/>
-            <w:vAlign w:val="center"/>
-          </w:tcPr>
-          <w:p>
-            <w:pPr>
-              <w:jc w:val="both"/>
-              <w:outlineLvl w:val="9"/>
-              <w:rPr>
-                <w:rFonts w:hint="default" w:cs="华文中宋"/>
-                <w:b/>
-                <w:bCs/>
-                <w:i w:val="0"/>
-                <w:caps w:val="0"/>
-                <w:color w:val="FF0000"/>
-                <w:spacing w:val="7"/>
-                <w:sz w:val="21"/>
-                <w:szCs w:val="21"/>
-                <w:shd w:val="clear" w:color="auto" w:fill="auto"/>
-                <w:vertAlign w:val="baseline"/>
-                <w:lang w:val="en-US" w:eastAsia="zh-CN"/>
-              </w:rPr>
-            </w:pPr>
-            <w:r>
-              <w:rPr>
-                <w:rFonts w:hint="eastAsia" w:cs="华文中宋"/>
-                <w:b/>
-                <w:bCs/>
-                <w:i w:val="0"/>
-                <w:caps w:val="0"/>
-                <w:color w:val="FF0000"/>
-                <w:spacing w:val="7"/>
-                <w:sz w:val="21"/>
-                <w:szCs w:val="21"/>
-                <w:shd w:val="clear" w:color="auto" w:fill="auto"/>
-                <w:vertAlign w:val="baseline"/>
-                <w:lang w:val="en-US" w:eastAsia="zh-CN"/>
-              </w:rPr>
-              <w:t>stem</w:t>
-            </w:r>
-          </w:p>
-        </w:tc>
-        <w:tc>
-          <w:tcPr>
-            <w:tcW w:w="0" w:type="auto"/>
-            <w:vAlign w:val="center"/>
-          </w:tcPr>
-          <w:p>
-            <w:pPr>
-              <w:jc w:val="both"/>
-              <w:outlineLvl w:val="9"/>
-              <w:rPr>
-                <w:rFonts w:hint="eastAsia" w:ascii="华文中宋" w:hAnsi="华文中宋" w:eastAsia="华文中宋" w:cs="华文中宋"/>
-                <w:b/>
-                <w:bCs/>
-                <w:i w:val="0"/>
-                <w:caps w:val="0"/>
-                <w:color w:val="EA82F1"/>
-                <w:spacing w:val="7"/>
-                <w:kern w:val="2"/>
-                <w:sz w:val="21"/>
-                <w:szCs w:val="21"/>
-                <w:lang w:val="en-US" w:eastAsia="zh-CN" w:bidi="ar-SA"/>
-              </w:rPr>
-            </w:pPr>
-            <w:r>
-              <w:rPr>
-                <w:rFonts w:hint="eastAsia" w:cs="华文中宋"/>
-                <w:b/>
-                <w:bCs/>
-                <w:i w:val="0"/>
-                <w:caps w:val="0"/>
-                <w:color w:val="ED7D31" w:themeColor="accent2"/>
-                <w:spacing w:val="7"/>
-                <w:sz w:val="21"/>
-                <w:szCs w:val="21"/>
-                <w:vertAlign w:val="baseline"/>
-                <w:lang w:val="en-US" w:eastAsia="zh-CN"/>
-                <w14:textFill>
-                  <w14:solidFill>
-                    <w14:schemeClr w14:val="accent2"/>
-                  </w14:solidFill>
-                </w14:textFill>
-              </w:rPr>
-              <w:t>无后缀</w:t>
-            </w:r>
-            <w:r>
-              <w:rPr>
-                <w:rFonts w:hint="eastAsia" w:cs="华文中宋"/>
-                <w:b/>
-                <w:bCs/>
-                <w:i w:val="0"/>
-                <w:caps w:val="0"/>
-                <w:color w:val="EA82F1"/>
-                <w:spacing w:val="7"/>
-                <w:sz w:val="21"/>
-                <w:szCs w:val="21"/>
-                <w:lang w:val="en-US" w:eastAsia="zh-CN"/>
-              </w:rPr>
-              <w:t>文件名</w:t>
-            </w:r>
-          </w:p>
-        </w:tc>
-      </w:tr>
-      <w:tr>
-        <w:tblPrEx>
-          <w:tblBorders>
-            <w:top w:val="single" w:color="auto" w:sz="4" w:space="0"/>
-            <w:left w:val="single" w:color="auto" w:sz="4" w:space="0"/>
-            <w:bottom w:val="single" w:color="auto" w:sz="4" w:space="0"/>
-            <w:right w:val="single" w:color="auto" w:sz="4" w:space="0"/>
-            <w:insideH w:val="single" w:color="auto" w:sz="4" w:space="0"/>
-            <w:insideV w:val="single" w:color="auto" w:sz="4" w:space="0"/>
-          </w:tblBorders>
-          <w:tblCellMar>
-            <w:top w:w="0" w:type="dxa"/>
-            <w:left w:w="108" w:type="dxa"/>
-            <w:bottom w:w="0" w:type="dxa"/>
-            <w:right w:w="108" w:type="dxa"/>
-          </w:tblCellMar>
-        </w:tblPrEx>
-        <w:tc>
-          <w:tcPr>
-            <w:tcW w:w="0" w:type="auto"/>
-            <w:vMerge w:val="continue"/>
-            <w:vAlign w:val="center"/>
-          </w:tcPr>
-          <w:p>
-            <w:pPr>
-              <w:outlineLvl w:val="9"/>
-              <w:rPr>
-                <w:rFonts w:hint="eastAsia" w:ascii="华文中宋" w:hAnsi="华文中宋" w:eastAsia="华文中宋" w:cs="华文中宋"/>
-                <w:b/>
-                <w:bCs/>
-                <w:i w:val="0"/>
-                <w:caps w:val="0"/>
-                <w:color w:val="ED7D31" w:themeColor="accent2"/>
-                <w:spacing w:val="7"/>
-                <w:sz w:val="21"/>
-                <w:szCs w:val="21"/>
-                <w:vertAlign w:val="baseline"/>
-                <w:lang w:val="en-US" w:eastAsia="zh-CN"/>
-                <w14:textFill>
-                  <w14:solidFill>
-                    <w14:schemeClr w14:val="accent2"/>
-                  </w14:solidFill>
-                </w14:textFill>
-              </w:rPr>
-            </w:pPr>
-          </w:p>
-        </w:tc>
-        <w:tc>
-          <w:tcPr>
-            <w:tcW w:w="0" w:type="auto"/>
-            <w:vAlign w:val="center"/>
-          </w:tcPr>
-          <w:p>
-            <w:pPr>
-              <w:jc w:val="both"/>
-              <w:outlineLvl w:val="9"/>
-              <w:rPr>
-                <w:rFonts w:hint="default" w:cs="华文中宋"/>
-                <w:b/>
-                <w:bCs/>
-                <w:i w:val="0"/>
-                <w:caps w:val="0"/>
-                <w:color w:val="FF0000"/>
-                <w:spacing w:val="7"/>
-                <w:sz w:val="21"/>
-                <w:szCs w:val="21"/>
-                <w:shd w:val="clear" w:color="auto" w:fill="auto"/>
-                <w:vertAlign w:val="baseline"/>
-                <w:lang w:val="en-US" w:eastAsia="zh-CN"/>
-              </w:rPr>
-            </w:pPr>
-            <w:r>
-              <w:rPr>
-                <w:rFonts w:hint="eastAsia" w:cs="华文中宋"/>
-                <w:b/>
-                <w:bCs/>
-                <w:i w:val="0"/>
-                <w:caps w:val="0"/>
-                <w:color w:val="FF0000"/>
-                <w:spacing w:val="7"/>
-                <w:sz w:val="21"/>
-                <w:szCs w:val="21"/>
-                <w:shd w:val="clear" w:color="auto" w:fill="auto"/>
-                <w:vertAlign w:val="baseline"/>
-                <w:lang w:val="en-US" w:eastAsia="zh-CN"/>
-              </w:rPr>
-              <w:t>suffix</w:t>
-            </w:r>
-          </w:p>
-        </w:tc>
-        <w:tc>
-          <w:tcPr>
-            <w:tcW w:w="0" w:type="auto"/>
-            <w:vAlign w:val="center"/>
-          </w:tcPr>
-          <w:p>
-            <w:pPr>
-              <w:jc w:val="both"/>
-              <w:outlineLvl w:val="9"/>
-              <w:rPr>
-                <w:rFonts w:hint="eastAsia" w:ascii="华文中宋" w:hAnsi="华文中宋" w:eastAsia="华文中宋" w:cs="华文中宋"/>
-                <w:b/>
-                <w:bCs/>
-                <w:i w:val="0"/>
-                <w:caps w:val="0"/>
-                <w:color w:val="ED7D31" w:themeColor="accent2"/>
-                <w:spacing w:val="7"/>
-                <w:kern w:val="2"/>
-                <w:sz w:val="21"/>
-                <w:szCs w:val="21"/>
-                <w:vertAlign w:val="baseline"/>
-                <w:lang w:val="en-US" w:eastAsia="zh-CN" w:bidi="ar-SA"/>
-                <w14:textFill>
-                  <w14:solidFill>
-                    <w14:schemeClr w14:val="accent2"/>
-                  </w14:solidFill>
-                </w14:textFill>
-              </w:rPr>
-            </w:pPr>
-            <w:r>
-              <w:rPr>
-                <w:rFonts w:hint="eastAsia" w:cs="华文中宋"/>
-                <w:b/>
-                <w:bCs/>
-                <w:i w:val="0"/>
-                <w:caps w:val="0"/>
-                <w:color w:val="EA82F1"/>
-                <w:spacing w:val="7"/>
-                <w:sz w:val="21"/>
-                <w:szCs w:val="21"/>
-                <w:lang w:val="en-US" w:eastAsia="zh-CN"/>
-              </w:rPr>
-              <w:t>后缀</w:t>
-            </w:r>
-            <w:r>
-              <w:rPr>
-                <w:rFonts w:hint="eastAsia" w:cs="华文中宋"/>
-                <w:b/>
-                <w:bCs/>
-                <w:i w:val="0"/>
-                <w:caps w:val="0"/>
-                <w:color w:val="ED7D31" w:themeColor="accent2"/>
-                <w:spacing w:val="7"/>
-                <w:sz w:val="21"/>
-                <w:szCs w:val="21"/>
-                <w:vertAlign w:val="baseline"/>
-                <w:lang w:val="en-US" w:eastAsia="zh-CN"/>
-                <w14:textFill>
-                  <w14:solidFill>
-                    <w14:schemeClr w14:val="accent2"/>
-                  </w14:solidFill>
-                </w14:textFill>
-              </w:rPr>
-              <w:t>名称</w:t>
+              <w:t>名/根/后缀</w:t>
             </w:r>
           </w:p>
         </w:tc>
@@ -7230,12 +6878,6 @@
             <w:insideH w:val="single" w:color="auto" w:sz="4" w:space="0"/>
             <w:insideV w:val="single" w:color="auto" w:sz="4" w:space="0"/>
           </w:tblBorders>
-          <w:tblCellMar>
-            <w:top w:w="0" w:type="dxa"/>
-            <w:left w:w="108" w:type="dxa"/>
-            <w:bottom w:w="0" w:type="dxa"/>
-            <w:right w:w="108" w:type="dxa"/>
-          </w:tblCellMar>
         </w:tblPrEx>
         <w:tc>
           <w:tcPr>
@@ -17357,8 +16999,6 @@
                 </w14:textFill>
               </w:rPr>
             </w:pPr>
-            <w:bookmarkStart w:id="23" w:name="_GoBack"/>
-            <w:bookmarkEnd w:id="23"/>
             <w:r>
               <w:rPr>
                 <w:rFonts w:hint="eastAsia" w:ascii="华文中宋" w:hAnsi="华文中宋" w:eastAsia="华文中宋" w:cs="华文中宋"/>
@@ -23787,8 +23427,8 @@
           <w:lang w:val="en-US" w:eastAsia="zh-CN"/>
         </w:rPr>
       </w:pPr>
-      <w:bookmarkStart w:id="17" w:name="_Toc8835"/>
-      <w:bookmarkStart w:id="18" w:name="_Toc11737"/>
+      <w:bookmarkStart w:id="17" w:name="_Toc11737"/>
+      <w:bookmarkStart w:id="18" w:name="_Toc8835"/>
       <w:bookmarkStart w:id="19" w:name="_Toc10366"/>
       <w:r>
         <w:rPr>

</xml_diff>